<commit_message>
Raw notes for May 2026 UTH added along with a correction to the factoring code in Jan 2026 A2D
</commit_message>
<xml_diff>
--- a/Posts/2026/01(Jan)/Aristotle2Digital/A2D_01(Jan)_2026_SymPy2.docx
+++ b/Posts/2026/01(Jan)/Aristotle2Digital/A2D_01(Jan)_2026_SymPy2.docx
@@ -15,7 +15,15 @@
         <w:t xml:space="preserve">Last month we started on a journey to </w:t>
       </w:r>
       <w:r>
-        <w:t>explore and experiment with the computer algebra system SymPy that is freely available in the Python ecosystem.</w:t>
+        <w:t xml:space="preserve">explore and experiment with the computer algebra system </w:t>
+      </w:r>
+      <w:proofErr w:type="spellStart"/>
+      <w:r>
+        <w:t>SymPy</w:t>
+      </w:r>
+      <w:proofErr w:type="spellEnd"/>
+      <w:r>
+        <w:t xml:space="preserve"> that is freely available in the Python ecosystem.</w:t>
       </w:r>
       <w:r>
         <w:t xml:space="preserve">  The aim is to create, within this package, a rule system that implements the basic transformations and identities of the Fourier Transform.  But the goal is very loose and a great deal of emphasis is placed on</w:t>
@@ -34,10 +42,62 @@
     </w:p>
     <w:p>
       <w:r>
-        <w:t>To keep things notationally simple,</w:t>
+        <w:t xml:space="preserve">To keep things </w:t>
+      </w:r>
+      <w:proofErr w:type="spellStart"/>
+      <w:r>
+        <w:t>notationally</w:t>
+      </w:r>
+      <w:proofErr w:type="spellEnd"/>
+      <w:r>
+        <w:t xml:space="preserve"> simple,</w:t>
       </w:r>
       <w:r>
         <w:t xml:space="preserve"> we’ll consider the very simple expression:</w:t>
+      </w:r>
+    </w:p>
+    <w:p>
+      <w:r>
+        <w:t>\[ D = \sqrt{ (x-a)^2 + y^2 } \; \]</w:t>
+      </w:r>
+    </w:p>
+    <w:p>
+      <w:r>
+        <w:t>m</w:t>
+      </w:r>
+      <w:r>
+        <w:t>ade up of the s</w:t>
+      </w:r>
+      <w:r>
+        <w:t>ymbols $\{</w:t>
+      </w:r>
+      <w:proofErr w:type="spellStart"/>
+      <w:r>
+        <w:t>a,x,y</w:t>
+      </w:r>
+      <w:proofErr w:type="spellEnd"/>
+      <w:r>
+        <w:t>\}$.</w:t>
+      </w:r>
+    </w:p>
+    <w:p>
+      <w:r>
+        <w:t>In a variety of settings, society ‘</w:t>
+      </w:r>
+      <w:r>
+        <w:t>expect</w:t>
+      </w:r>
+      <w:r>
+        <w:t>s’</w:t>
+      </w:r>
+      <w:r>
+        <w:t xml:space="preserve"> that competent students of algebra to either recognize </w:t>
+      </w:r>
+      <w:r>
+        <w:t>or</w:t>
+      </w:r>
+      <w:r>
+        <w:t>, at a minimum, be able to verify that</w:t>
       </w:r>
     </w:p>
     <w:p>
@@ -50,43 +110,21 @@
         <w:rPr>
           <w:lang w:val="es-ES"/>
         </w:rPr>
-        <w:t>\[ D = \sqrt{ (x-a)^2 + y^2 } \; \]</w:t>
-      </w:r>
-    </w:p>
-    <w:p>
-      <w:r>
-        <w:t>m</w:t>
-      </w:r>
-      <w:r>
-        <w:t>ade up of the s</w:t>
-      </w:r>
-      <w:r>
-        <w:t>ymbols $\{a,x,y\}$.</w:t>
-      </w:r>
-    </w:p>
-    <w:p>
-      <w:r>
-        <w:t>In a variety of settings, society ‘</w:t>
-      </w:r>
-      <w:r>
-        <w:t>expect</w:t>
-      </w:r>
-      <w:r>
-        <w:t>s’</w:t>
-      </w:r>
-      <w:r>
-        <w:t xml:space="preserve"> that competent students of algebra to either recognize </w:t>
-      </w:r>
-      <w:r>
-        <w:t>or</w:t>
-      </w:r>
-      <w:r>
-        <w:t>, at a minimum, be able to verify that</w:t>
-      </w:r>
-    </w:p>
-    <w:p>
-      <w:r>
-        <w:t>\[ D’ = \sqrt{ x^2 – 2  a x + a^2 + y^2} \; \]</w:t>
+        <w:t>\[ D’ = \</w:t>
+      </w:r>
+      <w:proofErr w:type="spellStart"/>
+      <w:r>
+        <w:rPr>
+          <w:lang w:val="es-ES"/>
+        </w:rPr>
+        <w:t>sqrt</w:t>
+      </w:r>
+      <w:proofErr w:type="spellEnd"/>
+      <w:r>
+        <w:rPr>
+          <w:lang w:val="es-ES"/>
+        </w:rPr>
+        <w:t>{ x^2 – 2  a x + a^2 + y^2} \; \]</w:t>
       </w:r>
     </w:p>
     <w:p>
@@ -129,7 +167,15 @@
         <w:t>mathematically equal</w:t>
       </w:r>
       <w:r>
-        <w:t xml:space="preserve"> to contain the meaning that a teacher wants to convey when he says that $D=D’$.  Mathematical equality means that for every choice of values for $\{a,x,y\}$ the numerical result obtained by substitution from $D$ is exactly the same as the numerical result obtained from $D’$ by the same process.</w:t>
+        <w:t xml:space="preserve"> to contain the meaning that a teacher wants to convey when he says that $D=D’$.  Mathematical equality means that for every choice of values for $\{</w:t>
+      </w:r>
+      <w:proofErr w:type="spellStart"/>
+      <w:r>
+        <w:t>a,x,y</w:t>
+      </w:r>
+      <w:proofErr w:type="spellEnd"/>
+      <w:r>
+        <w:t>\}$ the numerical result obtained by substitution from $D$ is exactly the same as the numerical result obtained from $D’$ by the same process.</w:t>
       </w:r>
     </w:p>
     <w:p>
@@ -187,12 +233,28 @@
     </w:p>
     <w:p>
       <w:r>
-        <w:t>\[ x \rightarrow q \; ,\]</w:t>
-      </w:r>
-    </w:p>
-    <w:p>
-      <w:r>
-        <w:t>\[ a \rightarrow q_0 \; , \]</w:t>
+        <w:t>\[ x \</w:t>
+      </w:r>
+      <w:proofErr w:type="spellStart"/>
+      <w:r>
+        <w:t>rightarrow</w:t>
+      </w:r>
+      <w:proofErr w:type="spellEnd"/>
+      <w:r>
+        <w:t xml:space="preserve"> q \; ,\]</w:t>
+      </w:r>
+    </w:p>
+    <w:p>
+      <w:r>
+        <w:t>\[ a \</w:t>
+      </w:r>
+      <w:proofErr w:type="spellStart"/>
+      <w:r>
+        <w:t>rightarrow</w:t>
+      </w:r>
+      <w:proofErr w:type="spellEnd"/>
+      <w:r>
+        <w:t xml:space="preserve"> q_0 \; , \]</w:t>
       </w:r>
     </w:p>
     <w:p>
@@ -202,7 +264,15 @@
     </w:p>
     <w:p>
       <w:r>
-        <w:t>\[ y \rightarrow p \; \]</w:t>
+        <w:t>\[ y \</w:t>
+      </w:r>
+      <w:proofErr w:type="spellStart"/>
+      <w:r>
+        <w:t>rightarrow</w:t>
+      </w:r>
+      <w:proofErr w:type="spellEnd"/>
+      <w:r>
+        <w:t xml:space="preserve"> p \; \]</w:t>
       </w:r>
     </w:p>
     <w:p>
@@ -228,7 +298,31 @@
         <w:t>symbols</w:t>
       </w:r>
       <w:r>
-        <w:t xml:space="preserve"> aren’t the same.  For example, if $x \in (-\infty,\infty)$ but we restrict $p \in [0,\infty]$, then, despite their structurally equality $D$</w:t>
+        <w:t xml:space="preserve"> aren’t the same.  For example, if $x \in (-\</w:t>
+      </w:r>
+      <w:proofErr w:type="spellStart"/>
+      <w:r>
+        <w:t>infty</w:t>
+      </w:r>
+      <w:proofErr w:type="spellEnd"/>
+      <w:r>
+        <w:t>,\</w:t>
+      </w:r>
+      <w:proofErr w:type="spellStart"/>
+      <w:r>
+        <w:t>infty</w:t>
+      </w:r>
+      <w:proofErr w:type="spellEnd"/>
+      <w:r>
+        <w:t>)$ but we restrict $p \in [0,\</w:t>
+      </w:r>
+      <w:proofErr w:type="spellStart"/>
+      <w:r>
+        <w:t>infty</w:t>
+      </w:r>
+      <w:proofErr w:type="spellEnd"/>
+      <w:r>
+        <w:t>]$, then, despite their structurally equality $D$</w:t>
       </w:r>
       <w:r>
         <w:t xml:space="preserve"> is not mathematically equal to $D’’$ when $x &lt; 0$.</w:t>
@@ -379,13 +473,29 @@
     </w:p>
     <w:p>
       <w:r>
-        <w:t xml:space="preserve">Driving this point home is easier done with a visual. Using the graphviz </w:t>
+        <w:t xml:space="preserve">Driving this point home is easier done with a visual. Using the </w:t>
+      </w:r>
+      <w:proofErr w:type="spellStart"/>
+      <w:r>
+        <w:t>graphviz</w:t>
+      </w:r>
+      <w:proofErr w:type="spellEnd"/>
+      <w:r>
+        <w:t xml:space="preserve"> </w:t>
       </w:r>
       <w:r>
         <w:t>application and the corresponding Python API, we can visually display how these various expressions are represented internally</w:t>
       </w:r>
       <w:r>
-        <w:t>.  SymPy uses a tree structure that</w:t>
+        <w:t xml:space="preserve">.  </w:t>
+      </w:r>
+      <w:proofErr w:type="spellStart"/>
+      <w:r>
+        <w:t>SymPy</w:t>
+      </w:r>
+      <w:proofErr w:type="spellEnd"/>
+      <w:r>
+        <w:t xml:space="preserve"> uses a tree structure that</w:t>
       </w:r>
       <w:r>
         <w:t>, for t</w:t>
@@ -416,7 +526,15 @@
     </w:p>
     <w:p>
       <w:r>
-        <w:t xml:space="preserve">Every node in the a SymPy tree is either a function or a symbol.  Functions </w:t>
+        <w:t xml:space="preserve">Every node in the a </w:t>
+      </w:r>
+      <w:proofErr w:type="spellStart"/>
+      <w:r>
+        <w:t>SymPy</w:t>
+      </w:r>
+      <w:proofErr w:type="spellEnd"/>
+      <w:r>
+        <w:t xml:space="preserve"> tree is either a function or a symbol.  Functions </w:t>
       </w:r>
       <w:r>
         <w:t xml:space="preserve">own (almost always) children nodes reflecting their </w:t>
@@ -443,7 +561,15 @@
         <w:t xml:space="preserve">that algebraically add together </w:t>
       </w:r>
       <w:r>
-        <w:t xml:space="preserve">while Half is a special symbol meaning 1/2.  SymPy reserves a special symbol for this since </w:t>
+        <w:t xml:space="preserve">while Half is a special symbol meaning 1/2.  </w:t>
+      </w:r>
+      <w:proofErr w:type="spellStart"/>
+      <w:r>
+        <w:t>SymPy</w:t>
+      </w:r>
+      <w:proofErr w:type="spellEnd"/>
+      <w:r>
+        <w:t xml:space="preserve"> reserves a special symbol for this since </w:t>
       </w:r>
       <w:r>
         <w:t xml:space="preserve">division by 2 is so common.  Of the four main branches of Add, three are </w:t>
@@ -497,7 +623,15 @@
         <w:t xml:space="preserve">The Add branch is now a polynomial expression </w:t>
       </w:r>
       <w:r>
-        <w:t>that we might be tempted to try SymPy’s factor on.  However, Factor doesn’t know what to do with the portion involving $y^2$</w:t>
+        <w:t xml:space="preserve">that we might be tempted to try </w:t>
+      </w:r>
+      <w:proofErr w:type="spellStart"/>
+      <w:r>
+        <w:t>SymPy’s</w:t>
+      </w:r>
+      <w:proofErr w:type="spellEnd"/>
+      <w:r>
+        <w:t xml:space="preserve"> factor on.  However, Factor doesn’t know what to do with the portion involving $y^2$</w:t>
       </w:r>
       <w:r>
         <w:t>.  However, if we isolate t</w:t>
@@ -519,19 +653,43 @@
     </w:p>
     <w:p>
       <w:r>
-        <w:t>This behavior is not unique to either this situation nor to SymPy.</w:t>
+        <w:t xml:space="preserve">This behavior is not unique to either this situation nor to </w:t>
+      </w:r>
+      <w:proofErr w:type="spellStart"/>
+      <w:r>
+        <w:t>SymPy</w:t>
+      </w:r>
+      <w:proofErr w:type="spellEnd"/>
+      <w:r>
+        <w:t>.</w:t>
       </w:r>
       <w:r>
         <w:t xml:space="preserve">  Asking Wolfram Alpha to factor $x^2 -2 a x + a^2$ works fine but </w:t>
       </w:r>
       <w:r>
-        <w:t>asking it to perform the same function on $x^2 -2ax + a^2 + y^2$ doesn’t give an acceptable answer (although its answer differs from SymPy</w:t>
-      </w:r>
-      <w:r>
-        <w:t>’s default</w:t>
-      </w:r>
-      <w:r>
-        <w:t xml:space="preserve"> but coincides with SymPy being</w:t>
+        <w:t xml:space="preserve">asking it to perform the same function on $x^2 -2ax + a^2 + y^2$ doesn’t give an acceptable answer (although its answer differs from </w:t>
+      </w:r>
+      <w:proofErr w:type="spellStart"/>
+      <w:r>
+        <w:t>SymPy</w:t>
+      </w:r>
+      <w:r>
+        <w:t>’s</w:t>
+      </w:r>
+      <w:proofErr w:type="spellEnd"/>
+      <w:r>
+        <w:t xml:space="preserve"> default</w:t>
+      </w:r>
+      <w:r>
+        <w:t xml:space="preserve"> but coincides with </w:t>
+      </w:r>
+      <w:proofErr w:type="spellStart"/>
+      <w:r>
+        <w:t>SymPy</w:t>
+      </w:r>
+      <w:proofErr w:type="spellEnd"/>
+      <w:r>
+        <w:t xml:space="preserve"> being</w:t>
       </w:r>
       <w:r>
         <w:t xml:space="preserve"> directed to factor of the field of the reals</w:t>
@@ -556,8 +714,13 @@
     </w:p>
     <w:p>
       <w:r>
-        <w:t>**quoteDiv</w:t>
-      </w:r>
+        <w:t>**</w:t>
+      </w:r>
+      <w:proofErr w:type="spellStart"/>
+      <w:r>
+        <w:t>quoteDiv</w:t>
+      </w:r>
+      <w:proofErr w:type="spellEnd"/>
       <w:r>
         <w:t xml:space="preserve"> &amp; pre**</w:t>
       </w:r>
@@ -567,7 +730,15 @@
         <w:t>a</w:t>
       </w:r>
       <w:r>
-        <w:t>, x, y = sym.symbols(</w:t>
+        <w:t xml:space="preserve">, x, y = </w:t>
+      </w:r>
+      <w:proofErr w:type="spellStart"/>
+      <w:r>
+        <w:t>sym.symbols</w:t>
+      </w:r>
+      <w:proofErr w:type="spellEnd"/>
+      <w:r>
+        <w:t>(</w:t>
       </w:r>
       <w:r>
         <w:t>‘a</w:t>
@@ -603,27 +774,59 @@
       </w:r>
     </w:p>
     <w:p>
+      <w:proofErr w:type="spellStart"/>
       <w:r>
         <w:t>a</w:t>
       </w:r>
       <w:r>
-        <w:t>x_part = sum(</w:t>
-      </w:r>
-    </w:p>
-    <w:p>
-      <w:r>
-        <w:t>    term for term in expr.as_ordered_terms()</w:t>
-      </w:r>
-    </w:p>
-    <w:p>
-      <w:r>
-        <w:t>    if term.has(</w:t>
+        <w:t>x_part</w:t>
+      </w:r>
+      <w:proofErr w:type="spellEnd"/>
+      <w:r>
+        <w:t xml:space="preserve"> = sum(</w:t>
+      </w:r>
+    </w:p>
+    <w:p>
+      <w:r>
+        <w:t xml:space="preserve">    term for term in </w:t>
+      </w:r>
+      <w:proofErr w:type="spellStart"/>
+      <w:r>
+        <w:t>poly</w:t>
+      </w:r>
+      <w:r>
+        <w:t>.as_ordered_terms</w:t>
+      </w:r>
+      <w:proofErr w:type="spellEnd"/>
+      <w:r>
+        <w:t>()</w:t>
+      </w:r>
+    </w:p>
+    <w:p>
+      <w:r>
+        <w:t xml:space="preserve">    if </w:t>
+      </w:r>
+      <w:proofErr w:type="spellStart"/>
+      <w:r>
+        <w:t>term.has</w:t>
+      </w:r>
+      <w:proofErr w:type="spellEnd"/>
+      <w:r>
+        <w:t>(</w:t>
       </w:r>
       <w:r>
         <w:t>a</w:t>
       </w:r>
       <w:r>
-        <w:t>, x) and not term.has(y)</w:t>
+        <w:t xml:space="preserve">, x) and not </w:t>
+      </w:r>
+      <w:proofErr w:type="spellStart"/>
+      <w:r>
+        <w:t>term.has</w:t>
+      </w:r>
+      <w:proofErr w:type="spellEnd"/>
+      <w:r>
+        <w:t>(y)</w:t>
       </w:r>
     </w:p>
     <w:p>
@@ -641,27 +844,47 @@
       <w:r>
         <w:t xml:space="preserve"> - </w:t>
       </w:r>
+      <w:proofErr w:type="spellStart"/>
       <w:r>
         <w:t>a</w:t>
       </w:r>
       <w:r>
         <w:t>x_part</w:t>
       </w:r>
-    </w:p>
-    <w:p>
-      <w:r>
-        <w:t>sym.factor(</w:t>
-      </w:r>
+      <w:proofErr w:type="spellEnd"/>
+    </w:p>
+    <w:p>
+      <w:proofErr w:type="spellStart"/>
+      <w:r>
+        <w:t>sym.factor</w:t>
+      </w:r>
+      <w:proofErr w:type="spellEnd"/>
+      <w:r>
+        <w:t>(</w:t>
+      </w:r>
+      <w:proofErr w:type="spellStart"/>
       <w:r>
         <w:t>a</w:t>
       </w:r>
       <w:r>
-        <w:t>x_part) + rest</w:t>
-      </w:r>
-    </w:p>
-    <w:p>
-      <w:r>
-        <w:t>**end quoteDiv**</w:t>
+        <w:t>x_part</w:t>
+      </w:r>
+      <w:proofErr w:type="spellEnd"/>
+      <w:r>
+        <w:t>) + rest</w:t>
+      </w:r>
+    </w:p>
+    <w:p>
+      <w:r>
+        <w:t xml:space="preserve">**end </w:t>
+      </w:r>
+      <w:proofErr w:type="spellStart"/>
+      <w:r>
+        <w:t>quoteDiv</w:t>
+      </w:r>
+      <w:proofErr w:type="spellEnd"/>
+      <w:r>
+        <w:t>**</w:t>
       </w:r>
     </w:p>
     <w:p>
@@ -690,7 +913,15 @@
         <w:t xml:space="preserve">t was also able to factor </w:t>
       </w:r>
       <w:r>
-        <w:t>a more difficult SymPy example of $</w:t>
+        <w:t xml:space="preserve">a more difficult </w:t>
+      </w:r>
+      <w:proofErr w:type="spellStart"/>
+      <w:r>
+        <w:t>SymPy</w:t>
+      </w:r>
+      <w:proofErr w:type="spellEnd"/>
+      <w:r>
+        <w:t xml:space="preserve"> example of $</w:t>
       </w:r>
       <w:r>
         <w:t>2x</w:t>
@@ -723,10 +954,26 @@
         <w:t xml:space="preserve">$ into </w:t>
       </w:r>
       <w:r>
-        <w:t>$2(x+y)(x^2 + 1)^2 + a$</w:t>
-      </w:r>
-      <w:r>
-        <w:t xml:space="preserve"> even though both Wolfram Alpha and Sympy could not</w:t>
+        <w:t>$2(</w:t>
+      </w:r>
+      <w:proofErr w:type="spellStart"/>
+      <w:r>
+        <w:t>x+y</w:t>
+      </w:r>
+      <w:proofErr w:type="spellEnd"/>
+      <w:r>
+        <w:t>)(x^2 + 1)^2 + a$</w:t>
+      </w:r>
+      <w:r>
+        <w:t xml:space="preserve"> even though both Wolfram Alpha and </w:t>
+      </w:r>
+      <w:proofErr w:type="spellStart"/>
+      <w:r>
+        <w:t>Sympy</w:t>
+      </w:r>
+      <w:proofErr w:type="spellEnd"/>
+      <w:r>
+        <w:t xml:space="preserve"> could not</w:t>
       </w:r>
       <w:r>
         <w:t xml:space="preserve"> out of the box</w:t>
@@ -774,8 +1021,13 @@
       <w:r>
         <w:t xml:space="preserve">these systems work better than I do.  The next logical question is then why are </w:t>
       </w:r>
-      <w:r>
-        <w:t xml:space="preserve">SymPy and Mathematica </w:t>
+      <w:proofErr w:type="spellStart"/>
+      <w:r>
+        <w:t>SymPy</w:t>
+      </w:r>
+      <w:proofErr w:type="spellEnd"/>
+      <w:r>
+        <w:t xml:space="preserve"> and Mathematica </w:t>
       </w:r>
       <w:r>
         <w:t>not out of business.  I think the only answer to this is that these success are superficial.</w:t>
@@ -1403,6 +1655,7 @@
   <w:style w:type="character" w:default="1" w:styleId="DefaultParagraphFont">
     <w:name w:val="Default Paragraph Font"/>
     <w:uiPriority w:val="1"/>
+    <w:semiHidden/>
     <w:unhideWhenUsed/>
   </w:style>
   <w:style w:type="table" w:default="1" w:styleId="TableNormal">

</xml_diff>